<commit_message>
Synthese v1.1: capaciteitsmonitor als primaire bron (na 3e87fe0)
Co-Authored-By: Claude Fable 5.1 <noreply@anthropic.com>
Claude-Session: https://claude.ai/code/session_015NSunMLHkxfSG4sNUpSCHf
</commit_message>
<xml_diff>
--- a/docs/Synthese_wachtlijsten_Vlaanderen_v1.1_2026-10-01.docx
+++ b/docs/Synthese_wachtlijsten_Vlaanderen_v1.1_2026-10-01.docx
@@ -2168,7 +2168,7 @@
                 <w:sz w:val="18"/>
                 <w:szCs w:val="18"/>
               </w:rPr>
-              <w:t xml:space="preserve">één lezing / secundair</w:t>
+              <w:t xml:space="preserve">één lezing</w:t>
             </w:r>
           </w:p>
         </w:tc>
@@ -11357,7 +11357,7 @@
                 <w:sz w:val="18"/>
                 <w:szCs w:val="18"/>
               </w:rPr>
-              <w:t xml:space="preserve">basisonderwijs 2.184 (7,3 % van de vraag), secundair 3.731 (15,1 %) – samen ± 5.700</w:t>
+              <w:t xml:space="preserve">basisonderwijs 2.184 (7,3 % van het verwachte aanbod), secundair 3.731 (15,1 %) – samen ± 5.700</w:t>
             </w:r>
           </w:p>
         </w:tc>
@@ -11391,7 +11391,7 @@
                 <w:sz w:val="18"/>
                 <w:szCs w:val="18"/>
               </w:rPr>
-              <w:t xml:space="preserve">capaciteitsmonitor HIVA/VUB, augustus 2025 (via pers)</w:t>
+              <w:t xml:space="preserve">capaciteitsmonitor HIVA/VUB, augustus 2025, tabellen 3.12 en 3.17</w:t>
             </w:r>
           </w:p>
         </w:tc>
@@ -15761,7 +15761,7 @@
                 <w:sz w:val="18"/>
                 <w:szCs w:val="18"/>
               </w:rPr>
-              <w:t xml:space="preserve">Capaciteitsmonitor-rapport zelf lezen (nu via pers); LOP-rapport Antwerpen 2026; leerlingen 2023-24 tot 2025-26 uit Dataloep</w:t>
+              <w:t xml:space="preserve">LOP-rapport Antwerpen 2026 (nu via pers); leerlingen 2023-24 tot 2025-26 uit Dataloep; tweede lezing capaciteitsmonitor</w:t>
             </w:r>
           </w:p>
         </w:tc>
@@ -15795,7 +15795,7 @@
                 <w:sz w:val="18"/>
                 <w:szCs w:val="18"/>
               </w:rPr>
-              <w:t xml:space="preserve">dev-sessie (lopend); Dataloep-export</w:t>
+              <w:t xml:space="preserve">LOP opvragen; Dataloep-export</w:t>
             </w:r>
           </w:p>
         </w:tc>

</xml_diff>